<commit_message>
Cap nhat huong dan: mo cmd truc tiep trong folder, lam ro ca thu muc 03. READING la goi day du; bo file trung lap trong HUONG_DAN
</commit_message>
<xml_diff>
--- a/HUONG_DAN/HuongDan_DoiSheet_AppsScript_GitHub.docx
+++ b/HUONG_DAN/HuongDan_DoiSheet_AppsScript_GitHub.docx
@@ -247,17 +247,43 @@
         <w:t xml:space="preserve">Bước 2 — </w:t>
       </w:r>
       <w:r>
-        <w:t xml:space="preserve">Mở Command Prompt (nhấn phím Windows + R, gõ </w:t>
-      </w:r>
-      <w:r>
-        <w:rPr>
-          <w:b/>
-          <w:bCs/>
-        </w:rPr>
-        <w:t xml:space="preserve">cmd</w:t>
-      </w:r>
-      <w:r>
-        <w:t xml:space="preserve">, Enter).</w:t>
+        <w:t xml:space="preserve">Mở Command Prompt </w:t>
+      </w:r>
+      <w:r>
+        <w:rPr>
+          <w:b/>
+          <w:bCs/>
+        </w:rPr>
+        <w:t xml:space="preserve">ngay bên trong thư mục 03. READING</w:t>
+      </w:r>
+      <w:r>
+        <w:t xml:space="preserve"> (không cần gõ lệnh cd) — mở thư mục này trong File Explorer, rồi làm 1 trong 2 cách:</w:t>
+      </w:r>
+    </w:p>
+    <w:p>
+      <w:pPr>
+        <w:pStyle w:val="ListParagraph"/>
+        <w:numPr>
+          <w:ilvl w:val="0"/>
+          <w:numId w:val="1"/>
+        </w:numPr>
+        <w:spacing w:after="80"/>
+      </w:pPr>
+      <w:r>
+        <w:t xml:space="preserve">Cách nhanh nhất (mọi phiên bản Windows): bấm vào thanh địa chỉ trên cùng cửa sổ File Explorer (chỗ đang hiện đường dẫn thư mục), gõ đè chữ "cmd", nhấn Enter. Command Prompt sẽ mở ra và đã tự đứng sẵn đúng trong thư mục này.</w:t>
+      </w:r>
+    </w:p>
+    <w:p>
+      <w:pPr>
+        <w:pStyle w:val="ListParagraph"/>
+        <w:numPr>
+          <w:ilvl w:val="0"/>
+          <w:numId w:val="1"/>
+        </w:numPr>
+        <w:spacing w:after="80"/>
+      </w:pPr>
+      <w:r>
+        <w:t xml:space="preserve">Cách khác: giữ phím Shift, bấm chuột phải vào khoảng trống trong thư mục (không bấm lên file nào) → chọn "Open PowerShell window here" (Windows 10) hoặc "Open in Terminal" (Windows 11).</w:t>
       </w:r>
     </w:p>
     <w:p>
@@ -273,7 +299,7 @@
         <w:t xml:space="preserve">Bước 3 — </w:t>
       </w:r>
       <w:r>
-        <w:t xml:space="preserve">Di chuyển vào đúng thư mục chứa file (copy-paste nguyên dòng):</w:t>
+        <w:t xml:space="preserve">Chạy lệnh, dán link Sheet vào giữa dấu ngoặc kép:</w:t>
       </w:r>
     </w:p>
     <w:tbl>
@@ -314,7 +340,7 @@
                 <w:sz w:val="20"/>
                 <w:szCs w:val="20"/>
               </w:rPr>
-              <w:t xml:space="preserve">cd "C:\Users\admin\Desktop\DATA GNOMIO\03. READING"</w:t>
+              <w:t xml:space="preserve">python update_links.py "https://docs.google.com/spreadsheets/d/1AbCdEfGhIjKlMnOpQrStUvWxYz/edit#gid=0"</w:t>
             </w:r>
           </w:p>
         </w:tc>
@@ -322,18 +348,18 @@
     </w:tbl>
     <w:p>
       <w:pPr>
-        <w:spacing w:after="100" w:before="200"/>
-      </w:pPr>
-      <w:r>
-        <w:rPr>
-          <w:b/>
-          <w:bCs/>
-          <w:color w:val="1E7B34"/>
-        </w:rPr>
-        <w:t xml:space="preserve">Bước 4 — </w:t>
-      </w:r>
-      <w:r>
-        <w:t xml:space="preserve">Chạy lệnh, dán link Sheet vào giữa dấu ngoặc kép:</w:t>
+        <w:spacing w:after="150"/>
+      </w:pPr>
+      <w:r>
+        <w:t xml:space="preserve">Nếu máy báo "python is not recognized" — máy chưa cài Python. Gửi link Sheet đó cho Claude trong đoạn chat, Claude sẽ chạy giúp.</w:t>
+      </w:r>
+    </w:p>
+    <w:p>
+      <w:pPr>
+        <w:spacing w:after="150"/>
+      </w:pPr>
+      <w:r>
+        <w:t xml:space="preserve">Nếu chạy thành công, màn hình hiện:</w:t>
       </w:r>
     </w:p>
     <w:tbl>
@@ -374,7 +400,21 @@
                 <w:sz w:val="20"/>
                 <w:szCs w:val="20"/>
               </w:rPr>
-              <w:t xml:space="preserve">python update_links.py "https://docs.google.com/spreadsheets/d/1AbCdEfGhIjKlMnOpQrStUvWxYz/edit#gid=0"</w:t>
+              <w:t xml:space="preserve">[OK] Da doi SHEET_ID -&gt; 1AbCdEfGhIjKlMnOpQrStUvWxYz  (WebTest_TheoDang/code.gs)</w:t>
+            </w:r>
+          </w:p>
+          <w:p>
+            <w:pPr>
+              <w:spacing w:after="0"/>
+            </w:pPr>
+            <w:r>
+              <w:rPr>
+                <w:rFonts w:ascii="Consolas" w:cs="Consolas" w:eastAsia="Consolas" w:hAnsi="Consolas"/>
+                <w:color w:val="D4D4D4"/>
+                <w:sz w:val="20"/>
+                <w:szCs w:val="20"/>
+              </w:rPr>
+              <w:t xml:space="preserve">[OK] Da dong bo ban cong khai (an API key) -&gt; WebTest_TheoDang/code.public.gs</w:t>
             </w:r>
           </w:p>
         </w:tc>
@@ -382,18 +422,183 @@
     </w:tbl>
     <w:p>
       <w:pPr>
-        <w:spacing w:after="150"/>
-      </w:pPr>
-      <w:r>
-        <w:t xml:space="preserve">Nếu máy báo "python is not recognized" — máy chưa cài Python. Gửi link Sheet đó cho Claude trong đoạn chat, Claude sẽ chạy giúp.</w:t>
-      </w:r>
-    </w:p>
-    <w:p>
-      <w:pPr>
-        <w:spacing w:after="150"/>
-      </w:pPr>
-      <w:r>
-        <w:t xml:space="preserve">Nếu chạy thành công, màn hình hiện:</w:t>
+        <w:spacing w:after="100" w:before="200"/>
+      </w:pPr>
+      <w:r>
+        <w:rPr>
+          <w:b/>
+          <w:bCs/>
+          <w:color w:val="1E7B34"/>
+        </w:rPr>
+        <w:t xml:space="preserve">Bước 4 — </w:t>
+      </w:r>
+      <w:r>
+        <w:t xml:space="preserve">QUAN TRỌNG — rất dễ quên: </w:t>
+      </w:r>
+      <w:r>
+        <w:rPr>
+          <w:b/>
+          <w:bCs/>
+        </w:rPr>
+        <w:t xml:space="preserve">lệnh trên chỉ sửa file trên máy bạn. Apps Script chạy trên server Google, không tự nhận file này.</w:t>
+      </w:r>
+    </w:p>
+    <w:p>
+      <w:pPr>
+        <w:pStyle w:val="ListParagraph"/>
+        <w:numPr>
+          <w:ilvl w:val="0"/>
+          <w:numId w:val="1"/>
+        </w:numPr>
+        <w:spacing w:after="80"/>
+      </w:pPr>
+      <w:r>
+        <w:t xml:space="preserve">Mở file WebTest_TheoDang/code.gs bằng Notepad, copy toàn bộ nội dung.</w:t>
+      </w:r>
+    </w:p>
+    <w:p>
+      <w:pPr>
+        <w:pStyle w:val="ListParagraph"/>
+        <w:numPr>
+          <w:ilvl w:val="0"/>
+          <w:numId w:val="1"/>
+        </w:numPr>
+        <w:spacing w:after="80"/>
+      </w:pPr>
+      <w:r>
+        <w:t xml:space="preserve">Vào script.google.com, mở đúng project Apps Script đang dùng cho hệ thống này.</w:t>
+      </w:r>
+    </w:p>
+    <w:p>
+      <w:pPr>
+        <w:pStyle w:val="ListParagraph"/>
+        <w:numPr>
+          <w:ilvl w:val="0"/>
+          <w:numId w:val="1"/>
+        </w:numPr>
+        <w:spacing w:after="80"/>
+      </w:pPr>
+      <w:r>
+        <w:t xml:space="preserve">Chọn hết code cũ (Ctrl+A), xoá, dán code mới vào (Ctrl+V), lưu (Ctrl+S).</w:t>
+      </w:r>
+    </w:p>
+    <w:p>
+      <w:pPr>
+        <w:pStyle w:val="ListParagraph"/>
+        <w:numPr>
+          <w:ilvl w:val="0"/>
+          <w:numId w:val="1"/>
+        </w:numPr>
+        <w:spacing w:after="80"/>
+      </w:pPr>
+      <w:r>
+        <w:t xml:space="preserve">Vì URL web app không đổi — không cần deploy lại, không cần sửa file HTML nào.</w:t>
+      </w:r>
+    </w:p>
+    <w:p>
+      <w:pPr>
+        <w:spacing w:after="150"/>
+      </w:pPr>
+    </w:p>
+    <w:p>
+      <w:pPr>
+        <w:pStyle w:val="Heading1"/>
+        <w:spacing w:after="200" w:before="400"/>
+      </w:pPr>
+      <w:r>
+        <w:t xml:space="preserve">3. Trường hợp 2 — Đổi sang tài khoản Google khác hoàn toàn (Sheet mới + Deploy lại)</w:t>
+      </w:r>
+    </w:p>
+    <w:p>
+      <w:pPr>
+        <w:spacing w:after="150"/>
+      </w:pPr>
+      <w:r>
+        <w:t xml:space="preserve">Dùng khi: chuyển cả hệ thống sang một tài khoản Google Drive khác — vừa tạo Sheet mới, vừa deploy lại Apps Script mới (sẽ có URL web app mới).</w:t>
+      </w:r>
+    </w:p>
+    <w:p>
+      <w:pPr>
+        <w:spacing w:after="100" w:before="200"/>
+      </w:pPr>
+      <w:r>
+        <w:rPr>
+          <w:b/>
+          <w:bCs/>
+          <w:color w:val="1E7B34"/>
+        </w:rPr>
+        <w:t xml:space="preserve">Bước 1 — </w:t>
+      </w:r>
+      <w:r>
+        <w:t xml:space="preserve">Đăng nhập tài khoản Google mới. Tạo 1 Google Sheet trống (tên gì cũng được). Không cần tạo sẵn tab/cột — code tự tạo khi có học viên nộp bài đầu tiên. Copy link Sheet.</w:t>
+      </w:r>
+    </w:p>
+    <w:p>
+      <w:pPr>
+        <w:spacing w:after="100" w:before="200"/>
+      </w:pPr>
+      <w:r>
+        <w:rPr>
+          <w:b/>
+          <w:bCs/>
+          <w:color w:val="1E7B34"/>
+        </w:rPr>
+        <w:t xml:space="preserve">Bước 2 — </w:t>
+      </w:r>
+      <w:r>
+        <w:t xml:space="preserve">Trong Sheet vừa tạo: menu </w:t>
+      </w:r>
+      <w:r>
+        <w:rPr>
+          <w:b/>
+          <w:bCs/>
+        </w:rPr>
+        <w:t xml:space="preserve">Tiện ích mở rộng (Extensions) → Apps Script</w:t>
+      </w:r>
+      <w:r>
+        <w:t xml:space="preserve">. Google mở 1 project script trống, tự gắn với Sheet này.</w:t>
+      </w:r>
+    </w:p>
+    <w:p>
+      <w:pPr>
+        <w:spacing w:after="100" w:before="200"/>
+      </w:pPr>
+      <w:r>
+        <w:rPr>
+          <w:b/>
+          <w:bCs/>
+          <w:color w:val="1E7B34"/>
+        </w:rPr>
+        <w:t xml:space="preserve">Bước 3 — </w:t>
+      </w:r>
+      <w:r>
+        <w:t xml:space="preserve">Mở file </w:t>
+      </w:r>
+      <w:r>
+        <w:rPr>
+          <w:b/>
+          <w:bCs/>
+        </w:rPr>
+        <w:t xml:space="preserve">WebTest_TheoDang/code.gs</w:t>
+      </w:r>
+      <w:r>
+        <w:t xml:space="preserve"> trên máy bạn (bản có API key thật — không phải code.public.gs), copy toàn bộ. Trong project Apps Script mới, xoá hết code mẫu, dán code của bạn vào, Ctrl+S.</w:t>
+      </w:r>
+    </w:p>
+    <w:p>
+      <w:pPr>
+        <w:spacing w:after="100" w:before="200"/>
+      </w:pPr>
+      <w:r>
+        <w:rPr>
+          <w:b/>
+          <w:bCs/>
+          <w:color w:val="1E7B34"/>
+        </w:rPr>
+        <w:t xml:space="preserve">Bước 4 — </w:t>
+      </w:r>
+      <w:r>
+        <w:t xml:space="preserve">Sửa 2 dòng cấu hình ngay trong trình soạn thảo Apps Script:</w:t>
       </w:r>
     </w:p>
     <w:tbl>
@@ -434,7 +639,7 @@
                 <w:sz w:val="20"/>
                 <w:szCs w:val="20"/>
               </w:rPr>
-              <w:t xml:space="preserve">[OK] Da doi SHEET_ID -&gt; 1AbCdEfGhIjKlMnOpQrStUvWxYz  (WebTest_TheoDang/code.gs)</w:t>
+              <w:t xml:space="preserve">var SHEET_ID       = "...";</w:t>
             </w:r>
           </w:p>
           <w:p>
@@ -448,7 +653,7 @@
                 <w:sz w:val="20"/>
                 <w:szCs w:val="20"/>
               </w:rPr>
-              <w:t xml:space="preserve">[OK] Da dong bo ban cong khai (an API key) -&gt; WebTest_TheoDang/code.public.gs</w:t>
+              <w:t xml:space="preserve">var TEACHER_EMAILS = ["rd.tbec@gmail.com"];</w:t>
             </w:r>
           </w:p>
         </w:tc>
@@ -456,6 +661,14 @@
     </w:tbl>
     <w:p>
       <w:pPr>
+        <w:spacing w:after="150"/>
+      </w:pPr>
+      <w:r>
+        <w:t xml:space="preserve">Sửa SHEET_ID thành ID của Sheet mới (đoạn ký tự dài giữa /d/ và /edit trong link Sheet). Nếu tài khoản mới dùng email giáo viên khác, sửa luôn TEACHER_EMAILS. CLAUDE_API_KEY giữ nguyên — không liên quan tới việc đổi tài khoản Google.</w:t>
+      </w:r>
+    </w:p>
+    <w:p>
+      <w:pPr>
         <w:spacing w:after="100" w:before="200"/>
       </w:pPr>
       <w:r>
@@ -467,14 +680,7 @@
         <w:t xml:space="preserve">Bước 5 — </w:t>
       </w:r>
       <w:r>
-        <w:t xml:space="preserve">QUAN TRỌNG — rất dễ quên: </w:t>
-      </w:r>
-      <w:r>
-        <w:rPr>
-          <w:b/>
-          <w:bCs/>
-        </w:rPr>
-        <w:t xml:space="preserve">lệnh trên chỉ sửa file trên máy bạn. Apps Script chạy trên server Google, không tự nhận file này.</w:t>
+        <w:t xml:space="preserve">Deploy thành Web App:</w:t>
       </w:r>
     </w:p>
     <w:p>
@@ -487,7 +693,7 @@
         <w:spacing w:after="80"/>
       </w:pPr>
       <w:r>
-        <w:t xml:space="preserve">Mở file WebTest_TheoDang/code.gs bằng Notepad, copy toàn bộ nội dung.</w:t>
+        <w:t xml:space="preserve">Góc trên phải → Deploy (Triển khai) → New deployment (Bản triển khai mới)</w:t>
       </w:r>
     </w:p>
     <w:p>
@@ -500,7 +706,7 @@
         <w:spacing w:after="80"/>
       </w:pPr>
       <w:r>
-        <w:t xml:space="preserve">Vào script.google.com, mở đúng project Apps Script đang dùng cho hệ thống này.</w:t>
+        <w:t xml:space="preserve">Biểu tượng bánh răng → chọn loại Web app</w:t>
       </w:r>
     </w:p>
     <w:p>
@@ -513,7 +719,7 @@
         <w:spacing w:after="80"/>
       </w:pPr>
       <w:r>
-        <w:t xml:space="preserve">Chọn hết code cũ (Ctrl+A), xoá, dán code mới vào (Ctrl+V), lưu (Ctrl+S).</w:t>
+        <w:t xml:space="preserve">"Execute as" chọn Me; "Who has access" chọn Anyone (bắt buộc, nếu không học viên không gửi được kết quả)</w:t>
       </w:r>
     </w:p>
     <w:p>
@@ -526,113 +732,23 @@
         <w:spacing w:after="80"/>
       </w:pPr>
       <w:r>
-        <w:t xml:space="preserve">Vì URL web app không đổi — không cần deploy lại, không cần sửa file HTML nào.</w:t>
-      </w:r>
-    </w:p>
-    <w:p>
-      <w:pPr>
-        <w:spacing w:after="150"/>
-      </w:pPr>
-    </w:p>
-    <w:p>
-      <w:pPr>
-        <w:pStyle w:val="Heading1"/>
-        <w:spacing w:after="200" w:before="400"/>
-      </w:pPr>
-      <w:r>
-        <w:t xml:space="preserve">3. Trường hợp 2 — Đổi sang tài khoản Google khác hoàn toàn (Sheet mới + Deploy lại)</w:t>
-      </w:r>
-    </w:p>
-    <w:p>
-      <w:pPr>
-        <w:spacing w:after="150"/>
-      </w:pPr>
-      <w:r>
-        <w:t xml:space="preserve">Dùng khi: chuyển cả hệ thống sang một tài khoản Google Drive khác — vừa tạo Sheet mới, vừa deploy lại Apps Script mới (sẽ có URL web app mới).</w:t>
-      </w:r>
-    </w:p>
-    <w:p>
-      <w:pPr>
-        <w:spacing w:after="100" w:before="200"/>
-      </w:pPr>
-      <w:r>
-        <w:rPr>
-          <w:b/>
-          <w:bCs/>
-          <w:color w:val="1E7B34"/>
-        </w:rPr>
-        <w:t xml:space="preserve">Bước 1 — </w:t>
-      </w:r>
-      <w:r>
-        <w:t xml:space="preserve">Đăng nhập tài khoản Google mới. Tạo 1 Google Sheet trống (tên gì cũng được). Không cần tạo sẵn tab/cột — code tự tạo khi có học viên nộp bài đầu tiên. Copy link Sheet.</w:t>
-      </w:r>
-    </w:p>
-    <w:p>
-      <w:pPr>
-        <w:spacing w:after="100" w:before="200"/>
-      </w:pPr>
-      <w:r>
-        <w:rPr>
-          <w:b/>
-          <w:bCs/>
-          <w:color w:val="1E7B34"/>
-        </w:rPr>
-        <w:t xml:space="preserve">Bước 2 — </w:t>
-      </w:r>
-      <w:r>
-        <w:t xml:space="preserve">Trong Sheet vừa tạo: menu </w:t>
-      </w:r>
-      <w:r>
-        <w:rPr>
-          <w:b/>
-          <w:bCs/>
-        </w:rPr>
-        <w:t xml:space="preserve">Tiện ích mở rộng (Extensions) → Apps Script</w:t>
-      </w:r>
-      <w:r>
-        <w:t xml:space="preserve">. Google mở 1 project script trống, tự gắn với Sheet này.</w:t>
-      </w:r>
-    </w:p>
-    <w:p>
-      <w:pPr>
-        <w:spacing w:after="100" w:before="200"/>
-      </w:pPr>
-      <w:r>
-        <w:rPr>
-          <w:b/>
-          <w:bCs/>
-          <w:color w:val="1E7B34"/>
-        </w:rPr>
-        <w:t xml:space="preserve">Bước 3 — </w:t>
-      </w:r>
-      <w:r>
-        <w:t xml:space="preserve">Mở file </w:t>
-      </w:r>
-      <w:r>
-        <w:rPr>
-          <w:b/>
-          <w:bCs/>
-        </w:rPr>
-        <w:t xml:space="preserve">WebTest_TheoDang/code.gs</w:t>
-      </w:r>
-      <w:r>
-        <w:t xml:space="preserve"> trên máy bạn (bản có API key thật — không phải code.public.gs), copy toàn bộ. Trong project Apps Script mới, xoá hết code mẫu, dán code của bạn vào, Ctrl+S.</w:t>
-      </w:r>
-    </w:p>
-    <w:p>
-      <w:pPr>
-        <w:spacing w:after="100" w:before="200"/>
-      </w:pPr>
-      <w:r>
-        <w:rPr>
-          <w:b/>
-          <w:bCs/>
-          <w:color w:val="1E7B34"/>
-        </w:rPr>
-        <w:t xml:space="preserve">Bước 4 — </w:t>
-      </w:r>
-      <w:r>
-        <w:t xml:space="preserve">Sửa 2 dòng cấu hình ngay trong trình soạn thảo Apps Script:</w:t>
+        <w:t xml:space="preserve">Bấm Deploy</w:t>
+      </w:r>
+    </w:p>
+    <w:p>
+      <w:pPr>
+        <w:spacing w:after="150"/>
+      </w:pPr>
+      <w:r>
+        <w:t xml:space="preserve">Lần đầu Google hiện màn hình xin quyền — bấm Advanced (Nâng cao) → Go to [tên project] (unsafe) → Allow. Đây là màn hình bình thường với mọi Apps Script tự viết, không phải lỗi.</w:t>
+      </w:r>
+    </w:p>
+    <w:p>
+      <w:pPr>
+        <w:spacing w:after="150"/>
+      </w:pPr>
+      <w:r>
+        <w:t xml:space="preserve">Sau khi deploy xong, Google cho 1 link dạng:</w:t>
       </w:r>
     </w:p>
     <w:tbl>
@@ -673,21 +789,7 @@
                 <w:sz w:val="20"/>
                 <w:szCs w:val="20"/>
               </w:rPr>
-              <w:t xml:space="preserve">var SHEET_ID       = "...";</w:t>
-            </w:r>
-          </w:p>
-          <w:p>
-            <w:pPr>
-              <w:spacing w:after="0"/>
-            </w:pPr>
-            <w:r>
-              <w:rPr>
-                <w:rFonts w:ascii="Consolas" w:cs="Consolas" w:eastAsia="Consolas" w:hAnsi="Consolas"/>
-                <w:color w:val="D4D4D4"/>
-                <w:sz w:val="20"/>
-                <w:szCs w:val="20"/>
-              </w:rPr>
-              <w:t xml:space="preserve">var TEACHER_EMAILS = ["rd.tbec@gmail.com"];</w:t>
+              <w:t xml:space="preserve">https://script.google.com/macros/s/AKfycb.........../exec</w:t>
             </w:r>
           </w:p>
         </w:tc>
@@ -698,7 +800,7 @@
         <w:spacing w:after="150"/>
       </w:pPr>
       <w:r>
-        <w:t xml:space="preserve">Sửa SHEET_ID thành ID của Sheet mới (đoạn ký tự dài giữa /d/ và /edit trong link Sheet). Nếu tài khoản mới dùng email giáo viên khác, sửa luôn TEACHER_EMAILS. CLAUDE_API_KEY giữ nguyên — không liên quan tới việc đổi tài khoản Google.</w:t>
+        <w:t xml:space="preserve">Copy lại link này.</w:t>
       </w:r>
     </w:p>
     <w:p>
@@ -711,78 +813,10 @@
           <w:bCs/>
           <w:color w:val="1E7B34"/>
         </w:rPr>
-        <w:t xml:space="preserve">Bước 5 — </w:t>
-      </w:r>
-      <w:r>
-        <w:t xml:space="preserve">Deploy thành Web App:</w:t>
-      </w:r>
-    </w:p>
-    <w:p>
-      <w:pPr>
-        <w:pStyle w:val="ListParagraph"/>
-        <w:numPr>
-          <w:ilvl w:val="0"/>
-          <w:numId w:val="1"/>
-        </w:numPr>
-        <w:spacing w:after="80"/>
-      </w:pPr>
-      <w:r>
-        <w:t xml:space="preserve">Góc trên phải → Deploy (Triển khai) → New deployment (Bản triển khai mới)</w:t>
-      </w:r>
-    </w:p>
-    <w:p>
-      <w:pPr>
-        <w:pStyle w:val="ListParagraph"/>
-        <w:numPr>
-          <w:ilvl w:val="0"/>
-          <w:numId w:val="1"/>
-        </w:numPr>
-        <w:spacing w:after="80"/>
-      </w:pPr>
-      <w:r>
-        <w:t xml:space="preserve">Biểu tượng bánh răng → chọn loại Web app</w:t>
-      </w:r>
-    </w:p>
-    <w:p>
-      <w:pPr>
-        <w:pStyle w:val="ListParagraph"/>
-        <w:numPr>
-          <w:ilvl w:val="0"/>
-          <w:numId w:val="1"/>
-        </w:numPr>
-        <w:spacing w:after="80"/>
-      </w:pPr>
-      <w:r>
-        <w:t xml:space="preserve">"Execute as" chọn Me; "Who has access" chọn Anyone (bắt buộc, nếu không học viên không gửi được kết quả)</w:t>
-      </w:r>
-    </w:p>
-    <w:p>
-      <w:pPr>
-        <w:pStyle w:val="ListParagraph"/>
-        <w:numPr>
-          <w:ilvl w:val="0"/>
-          <w:numId w:val="1"/>
-        </w:numPr>
-        <w:spacing w:after="80"/>
-      </w:pPr>
-      <w:r>
-        <w:t xml:space="preserve">Bấm Deploy</w:t>
-      </w:r>
-    </w:p>
-    <w:p>
-      <w:pPr>
-        <w:spacing w:after="150"/>
-      </w:pPr>
-      <w:r>
-        <w:t xml:space="preserve">Lần đầu Google hiện màn hình xin quyền — bấm Advanced (Nâng cao) → Go to [tên project] (unsafe) → Allow. Đây là màn hình bình thường với mọi Apps Script tự viết, không phải lỗi.</w:t>
-      </w:r>
-    </w:p>
-    <w:p>
-      <w:pPr>
-        <w:spacing w:after="150"/>
-      </w:pPr>
-      <w:r>
-        <w:t xml:space="preserve">Sau khi deploy xong, Google cho 1 link dạng:</w:t>
+        <w:t xml:space="preserve">Bước 6 — </w:t>
+      </w:r>
+      <w:r>
+        <w:t xml:space="preserve">Mở Command Prompt ngay trong thư mục 03. READING (cách mở — xem Mục 2, Bước 2), rồi chạy 1 lệnh duy nhất, dán cả 2 link cách nhau 1 khoảng trắng:</w:t>
       </w:r>
     </w:p>
     <w:tbl>
@@ -823,7 +857,7 @@
                 <w:sz w:val="20"/>
                 <w:szCs w:val="20"/>
               </w:rPr>
-              <w:t xml:space="preserve">https://script.google.com/macros/s/AKfycb.........../exec</w:t>
+              <w:t xml:space="preserve">python update_links.py "link-sheet-moi" "link-apps-script-moi"</w:t>
             </w:r>
           </w:p>
         </w:tc>
@@ -834,23 +868,7 @@
         <w:spacing w:after="150"/>
       </w:pPr>
       <w:r>
-        <w:t xml:space="preserve">Copy lại link này.</w:t>
-      </w:r>
-    </w:p>
-    <w:p>
-      <w:pPr>
-        <w:spacing w:after="100" w:before="200"/>
-      </w:pPr>
-      <w:r>
-        <w:rPr>
-          <w:b/>
-          <w:bCs/>
-          <w:color w:val="1E7B34"/>
-        </w:rPr>
-        <w:t xml:space="preserve">Bước 6 — </w:t>
-      </w:r>
-      <w:r>
-        <w:t xml:space="preserve">Chạy 1 lệnh duy nhất để cập nhật toàn bộ hệ thống trên máy bạn — dán cả 2 link, cách nhau 1 khoảng trắng:</w:t>
+        <w:t xml:space="preserve">Lệnh này: đổi SHEET_ID trong code.gs (khớp với bước 4), và đổi APPS_SCRIPT_URL trong toàn bộ ~95 file HTML (10 bài test gốc + 74 web test theo dạng) sang link Apps Script mới.</w:t>
       </w:r>
     </w:p>
     <w:tbl>
@@ -872,12 +890,18 @@
         <w:tc>
           <w:tcPr>
             <w:tcW w:type="pct" w:w="100%"/>
-            <w:shd w:fill="1E1E1E" w:val="clear"/>
+            <w:tcBorders>
+              <w:top w:val="single" w:color="E0C36A" w:sz="4"/>
+              <w:left w:val="single" w:color="E0C36A" w:sz="4"/>
+              <w:bottom w:val="single" w:color="E0C36A" w:sz="4"/>
+              <w:right w:val="single" w:color="E0C36A" w:sz="4"/>
+            </w:tcBorders>
+            <w:shd w:fill="FFF4CE" w:val="clear"/>
             <w:tcMar>
               <w:top w:type="dxa" w:w="120"/>
-              <w:left w:type="dxa" w:w="150"/>
+              <w:left w:type="dxa" w:w="180"/>
               <w:bottom w:type="dxa" w:w="120"/>
-              <w:right w:type="dxa" w:w="150"/>
+              <w:right w:type="dxa" w:w="180"/>
             </w:tcMar>
           </w:tcPr>
           <w:p>
@@ -886,26 +910,13 @@
             </w:pPr>
             <w:r>
               <w:rPr>
-                <w:rFonts w:ascii="Consolas" w:cs="Consolas" w:eastAsia="Consolas" w:hAnsi="Consolas"/>
-                <w:color w:val="D4D4D4"/>
-                <w:sz w:val="20"/>
-                <w:szCs w:val="20"/>
+                <w:b/>
+                <w:bCs/>
               </w:rPr>
-              <w:t xml:space="preserve">cd "C:\Users\admin\Desktop\DATA GNOMIO\03. READING"</w:t>
-            </w:r>
-          </w:p>
-          <w:p>
-            <w:pPr>
-              <w:spacing w:after="0"/>
-            </w:pPr>
-            <w:r>
-              <w:rPr>
-                <w:rFonts w:ascii="Consolas" w:cs="Consolas" w:eastAsia="Consolas" w:hAnsi="Consolas"/>
-                <w:color w:val="D4D4D4"/>
-                <w:sz w:val="20"/>
-                <w:szCs w:val="20"/>
-              </w:rPr>
-              <w:t xml:space="preserve">python update_links.py "link-sheet-moi" "link-apps-script-moi"</w:t>
+              <w:t xml:space="preserve">LƯU Ý: </w:t>
+            </w:r>
+            <w:r>
+              <w:t xml:space="preserve">Nếu không có Python trên máy, gửi 2 link vào đoạn chat với Claude, Claude chạy giúp.</w:t>
             </w:r>
           </w:p>
         </w:tc>
@@ -913,10 +924,108 @@
     </w:tbl>
     <w:p>
       <w:pPr>
-        <w:spacing w:after="150"/>
-      </w:pPr>
-      <w:r>
-        <w:t xml:space="preserve">Lệnh này: đổi SHEET_ID trong code.gs (khớp với bước 4), và đổi APPS_SCRIPT_URL trong toàn bộ ~95 file HTML (10 bài test gốc + 74 web test theo dạng) sang link Apps Script mới.</w:t>
+        <w:spacing w:after="100" w:before="200"/>
+      </w:pPr>
+      <w:r>
+        <w:rPr>
+          <w:b/>
+          <w:bCs/>
+          <w:color w:val="1E7B34"/>
+        </w:rPr>
+        <w:t xml:space="preserve">Bước 7 — </w:t>
+      </w:r>
+      <w:r>
+        <w:t xml:space="preserve">Test thử trước khi giao học viên: mở 1 file HTML, làm vài câu, nộp bài, kiểm tra kết quả có xuất hiện trong Sheet mới không.</w:t>
+      </w:r>
+    </w:p>
+    <w:p>
+      <w:pPr>
+        <w:spacing w:after="150"/>
+      </w:pPr>
+      <w:r>
+        <w:t xml:space="preserve">Nếu các file HTML đang được học viên truy cập qua GitHub Pages hoặc nơi host khác, nhớ chạy push_github.bat (xem Mục 4) để đẩy bản đã cập nhật link lên đó.</w:t>
+      </w:r>
+    </w:p>
+    <w:p>
+      <w:pPr>
+        <w:spacing w:after="150"/>
+      </w:pPr>
+    </w:p>
+    <w:p>
+      <w:pPr>
+        <w:pStyle w:val="Heading1"/>
+        <w:spacing w:after="200" w:before="400"/>
+      </w:pPr>
+      <w:r>
+        <w:t xml:space="preserve">4. Đẩy code lên GitHub</w:t>
+      </w:r>
+    </w:p>
+    <w:p>
+      <w:pPr>
+        <w:spacing w:after="150"/>
+      </w:pPr>
+      <w:r>
+        <w:t xml:space="preserve">Repo hiện tại: tientran-tbec/FLIGHT-TO-SUCCESS (Public). Vì là Public, API key Claude thật KHÔNG được đẩy lên — file code.gs (có key thật) bị chặn bởi .gitignore; chỉ bản code.public.gs (key đã ẩn thành YOUR_CLAUDE_API_KEY_HERE) được đẩy lên.</w:t>
+      </w:r>
+    </w:p>
+    <w:p>
+      <w:pPr>
+        <w:spacing w:after="100" w:before="200"/>
+      </w:pPr>
+      <w:r>
+        <w:rPr>
+          <w:b/>
+          <w:bCs/>
+          <w:color w:val="1E7B34"/>
+        </w:rPr>
+        <w:t xml:space="preserve">Bước 1 — </w:t>
+      </w:r>
+      <w:r>
+        <w:t xml:space="preserve">Mở thư mục </w:t>
+      </w:r>
+      <w:r>
+        <w:rPr>
+          <w:b/>
+          <w:bCs/>
+        </w:rPr>
+        <w:t xml:space="preserve">03. READING</w:t>
+      </w:r>
+      <w:r>
+        <w:t xml:space="preserve"> trong File Explorer.</w:t>
+      </w:r>
+    </w:p>
+    <w:p>
+      <w:pPr>
+        <w:spacing w:after="100" w:before="200"/>
+      </w:pPr>
+      <w:r>
+        <w:rPr>
+          <w:b/>
+          <w:bCs/>
+          <w:color w:val="1E7B34"/>
+        </w:rPr>
+        <w:t xml:space="preserve">Bước 2 — </w:t>
+      </w:r>
+      <w:r>
+        <w:t xml:space="preserve">Double-click file </w:t>
+      </w:r>
+      <w:r>
+        <w:rPr>
+          <w:b/>
+          <w:bCs/>
+        </w:rPr>
+        <w:t xml:space="preserve">push_github.bat</w:t>
+      </w:r>
+      <w:r>
+        <w:t xml:space="preserve">.</w:t>
+      </w:r>
+    </w:p>
+    <w:p>
+      <w:pPr>
+        <w:spacing w:after="150"/>
+      </w:pPr>
+      <w:r>
+        <w:t xml:space="preserve">File này tự động: đồng bộ lại code.public.gs (ẩn key), commit mọi thay đổi, và push lên GitHub. Không cần nhập lại tài khoản/token — đã được lưu sẵn trong cấu hình Git trên máy.</w:t>
       </w:r>
     </w:p>
     <w:tbl>
@@ -964,7 +1073,7 @@
               <w:t xml:space="preserve">LƯU Ý: </w:t>
             </w:r>
             <w:r>
-              <w:t xml:space="preserve">Nếu không có Python trên máy, gửi 2 link vào đoạn chat với Claude, Claude chạy giúp.</w:t>
+              <w:t xml:space="preserve">Chạy push_github.bat SAU KHI đã chạy update_links.py, để bản trên GitHub luôn khớp với link Sheet/Apps Script mới nhất.</w:t>
             </w:r>
           </w:p>
         </w:tc>
@@ -972,30 +1081,6 @@
     </w:tbl>
     <w:p>
       <w:pPr>
-        <w:spacing w:after="100" w:before="200"/>
-      </w:pPr>
-      <w:r>
-        <w:rPr>
-          <w:b/>
-          <w:bCs/>
-          <w:color w:val="1E7B34"/>
-        </w:rPr>
-        <w:t xml:space="preserve">Bước 7 — </w:t>
-      </w:r>
-      <w:r>
-        <w:t xml:space="preserve">Test thử trước khi giao học viên: mở 1 file HTML, làm vài câu, nộp bài, kiểm tra kết quả có xuất hiện trong Sheet mới không.</w:t>
-      </w:r>
-    </w:p>
-    <w:p>
-      <w:pPr>
-        <w:spacing w:after="150"/>
-      </w:pPr>
-      <w:r>
-        <w:t xml:space="preserve">Nếu các file HTML đang được học viên truy cập qua GitHub Pages hoặc nơi host khác, nhớ chạy push_github.bat (xem Mục 4) để đẩy bản đã cập nhật link lên đó.</w:t>
-      </w:r>
-    </w:p>
-    <w:p>
-      <w:pPr>
         <w:spacing w:after="150"/>
       </w:pPr>
     </w:p>
@@ -1005,75 +1090,115 @@
         <w:spacing w:after="200" w:before="400"/>
       </w:pPr>
       <w:r>
-        <w:t xml:space="preserve">4. Đẩy code lên GitHub</w:t>
-      </w:r>
-    </w:p>
-    <w:p>
-      <w:pPr>
-        <w:spacing w:after="150"/>
-      </w:pPr>
-      <w:r>
-        <w:t xml:space="preserve">Repo hiện tại: tientran-tbec/FLIGHT-TO-SUCCESS (Public). Vì là Public, API key Claude thật KHÔNG được đẩy lên — file code.gs (có key thật) bị chặn bởi .gitignore; chỉ bản code.public.gs (key đã ẩn thành YOUR_CLAUDE_API_KEY_HERE) được đẩy lên.</w:t>
-      </w:r>
-    </w:p>
-    <w:p>
-      <w:pPr>
-        <w:spacing w:after="100" w:before="200"/>
-      </w:pPr>
+        <w:t xml:space="preserve">5. Copy toàn bộ hệ thống sang máy tính mới</w:t>
+      </w:r>
+    </w:p>
+    <w:p>
+      <w:pPr>
+        <w:spacing w:after="150"/>
+      </w:pPr>
+      <w:r>
+        <w:t xml:space="preserve">Toàn bộ thư mục 03. READING là 1 gói đầy đủ, tự chứa mọi thứ cần thiết — không phụ thuộc file hay đường dẫn nào bên ngoài nó. Khi cần chuyển sang máy tính khác (cài lại máy, đưa cho người khác quản lý...), chỉ cần làm đúng 1 việc:</w:t>
+      </w:r>
+    </w:p>
+    <w:p>
+      <w:pPr>
+        <w:spacing w:after="150"/>
+      </w:pPr>
+      <w:r>
+        <w:rPr>
+          <w:b/>
+          <w:bCs/>
+        </w:rPr>
+        <w:t xml:space="preserve">Copy nguyên vẹn CẢ THƯ MỤC </w:t>
+      </w:r>
       <w:r>
         <w:rPr>
           <w:b/>
           <w:bCs/>
           <w:color w:val="1E7B34"/>
         </w:rPr>
-        <w:t xml:space="preserve">Bước 1 — </w:t>
-      </w:r>
-      <w:r>
-        <w:t xml:space="preserve">Mở thư mục </w:t>
-      </w:r>
-      <w:r>
-        <w:rPr>
-          <w:b/>
-          <w:bCs/>
-        </w:rPr>
         <w:t xml:space="preserve">03. READING</w:t>
       </w:r>
       <w:r>
-        <w:t xml:space="preserve"> trong File Explorer.</w:t>
-      </w:r>
-    </w:p>
-    <w:p>
-      <w:pPr>
-        <w:spacing w:after="100" w:before="200"/>
-      </w:pPr>
-      <w:r>
-        <w:rPr>
-          <w:b/>
-          <w:bCs/>
-          <w:color w:val="1E7B34"/>
-        </w:rPr>
-        <w:t xml:space="preserve">Bước 2 — </w:t>
-      </w:r>
-      <w:r>
-        <w:t xml:space="preserve">Double-click file </w:t>
-      </w:r>
-      <w:r>
-        <w:rPr>
-          <w:b/>
-          <w:bCs/>
-        </w:rPr>
-        <w:t xml:space="preserve">push_github.bat</w:t>
-      </w:r>
-      <w:r>
-        <w:t xml:space="preserve">.</w:t>
-      </w:r>
-    </w:p>
-    <w:p>
-      <w:pPr>
-        <w:spacing w:after="150"/>
-      </w:pPr>
-      <w:r>
-        <w:t xml:space="preserve">File này tự động: đồng bộ lại code.public.gs (ẩn key), commit mọi thay đổi, và push lên GitHub. Không cần nhập lại tài khoản/token — đã được lưu sẵn trong cấu hình Git trên máy.</w:t>
+        <w:rPr>
+          <w:b/>
+          <w:bCs/>
+        </w:rPr>
+        <w:t xml:space="preserve"> (không phải chỉ copy HUONG_DAN) sang máy mới — qua USB, OneDrive, Google Drive, hoặc dây cáp — giữ nguyên toàn bộ cấu trúc bên trong.</w:t>
+      </w:r>
+    </w:p>
+    <w:p>
+      <w:pPr>
+        <w:spacing w:after="150"/>
+      </w:pPr>
+      <w:r>
+        <w:t xml:space="preserve">Thư mục này đã có sẵn:</w:t>
+      </w:r>
+    </w:p>
+    <w:p>
+      <w:pPr>
+        <w:pStyle w:val="ListParagraph"/>
+        <w:numPr>
+          <w:ilvl w:val="0"/>
+          <w:numId w:val="1"/>
+        </w:numPr>
+        <w:spacing w:after="80"/>
+      </w:pPr>
+      <w:r>
+        <w:t xml:space="preserve">Toàn bộ 10 bài test gốc + 74 web test theo dạng câu hỏi (file HTML, chạy được ngay, không cần cài gì).</w:t>
+      </w:r>
+    </w:p>
+    <w:p>
+      <w:pPr>
+        <w:pStyle w:val="ListParagraph"/>
+        <w:numPr>
+          <w:ilvl w:val="0"/>
+          <w:numId w:val="1"/>
+        </w:numPr>
+        <w:spacing w:after="80"/>
+      </w:pPr>
+      <w:r>
+        <w:t xml:space="preserve">Apps Script (code.gs — có API key thật, và code.public.gs — bản ẩn key).</w:t>
+      </w:r>
+    </w:p>
+    <w:p>
+      <w:pPr>
+        <w:pStyle w:val="ListParagraph"/>
+        <w:numPr>
+          <w:ilvl w:val="0"/>
+          <w:numId w:val="1"/>
+        </w:numPr>
+        <w:spacing w:after="80"/>
+      </w:pPr>
+      <w:r>
+        <w:t xml:space="preserve">2 script hỗ trợ: update_links.py và push_github.bat.</w:t>
+      </w:r>
+    </w:p>
+    <w:p>
+      <w:pPr>
+        <w:pStyle w:val="ListParagraph"/>
+        <w:numPr>
+          <w:ilvl w:val="0"/>
+          <w:numId w:val="1"/>
+        </w:numPr>
+        <w:spacing w:after="80"/>
+      </w:pPr>
+      <w:r>
+        <w:t xml:space="preserve">5 file Word tổng hợp theo dạng câu hỏi, và chính file hướng dẫn này.</w:t>
+      </w:r>
+    </w:p>
+    <w:p>
+      <w:pPr>
+        <w:pStyle w:val="ListParagraph"/>
+        <w:numPr>
+          <w:ilvl w:val="0"/>
+          <w:numId w:val="1"/>
+        </w:numPr>
+        <w:spacing w:after="80"/>
+      </w:pPr>
+      <w:r>
+        <w:t xml:space="preserve">Repo Git đã kết nối sẵn tới GitHub (tientran-tbec/FLIGHT-TO-SUCCESS) — máy mới chỉ cần cài Git là push được luôn, không cần git init lại.</w:t>
       </w:r>
     </w:p>
     <w:tbl>
@@ -1121,7 +1246,7 @@
               <w:t xml:space="preserve">LƯU Ý: </w:t>
             </w:r>
             <w:r>
-              <w:t xml:space="preserve">Chạy push_github.bat SAU KHI đã chạy update_links.py, để bản trên GitHub luôn khớp với link Sheet/Apps Script mới nhất.</w:t>
+              <w:t xml:space="preserve">Máy mới cần cài sẵn Python (để chạy update_links.py) và Git (để chạy push_github.bat). Nếu máy mới chưa cài, 2 việc đó có thể nhờ Claude làm hộ qua đoạn chat — chỉ cần thư mục này được kết nối với Claude.</w:t>
             </w:r>
           </w:p>
         </w:tc>
@@ -1131,6 +1256,21 @@
       <w:pPr>
         <w:spacing w:after="150"/>
       </w:pPr>
+      <w:r>
+        <w:rPr>
+          <w:i/>
+          <w:iCs/>
+          <w:color w:val="595959"/>
+          <w:sz w:val="20"/>
+          <w:szCs w:val="20"/>
+        </w:rPr>
+        <w:t xml:space="preserve">Thư mục HUONG_DAN chỉ là nơi để file hướng dẫn này cho dễ tìm — các file thật sự chạy được (update_links.py, push_github.bat, code.gs) vẫn nằm ở vị trí gốc của chúng (thư mục 03. READING và WebTest_TheoDang) và đó là nơi duy nhất nên chạy chúng từ đó.</w:t>
+      </w:r>
+    </w:p>
+    <w:p>
+      <w:pPr>
+        <w:spacing w:after="150"/>
+      </w:pPr>
     </w:p>
     <w:p>
       <w:pPr>
@@ -1138,7 +1278,7 @@
         <w:spacing w:after="200" w:before="400"/>
       </w:pPr>
       <w:r>
-        <w:t xml:space="preserve">5. Danh sách file trong thư mục HUONG_DAN này</w:t>
+        <w:t xml:space="preserve">6. Danh sách các file quan trọng (trong thư mục 03. READING)</w:t>
       </w:r>
     </w:p>
     <w:tbl>
@@ -1193,7 +1333,7 @@
           </w:tcPr>
           <w:p>
             <w:r>
-              <w:t xml:space="preserve">Script đổi link Sheet / Apps Script — chạy bằng lệnh python update_links.py "&lt;link&gt;".</w:t>
+              <w:t xml:space="preserve">Nằm ở thư mục gốc 03. READING. Script đổi link Sheet / Apps Script — chạy bằng lệnh python update_links.py "&lt;link&gt;".</w:t>
             </w:r>
           </w:p>
         </w:tc>
@@ -1234,7 +1374,7 @@
           </w:tcPr>
           <w:p>
             <w:r>
-              <w:t xml:space="preserve">Double-click để đồng bộ + commit + push code lên GitHub.</w:t>
+              <w:t xml:space="preserve">Nằm ở thư mục gốc 03. READING. Double-click để đồng bộ + commit + push code lên GitHub.</w:t>
             </w:r>
           </w:p>
         </w:tc>
@@ -1259,7 +1399,7 @@
                 <w:sz w:val="20"/>
                 <w:szCs w:val="20"/>
               </w:rPr>
-              <w:t xml:space="preserve">code.public.gs</w:t>
+              <w:t xml:space="preserve">WebTest_TheoDang/code.gs</w:t>
             </w:r>
           </w:p>
         </w:tc>
@@ -1275,32 +1415,94 @@
           </w:tcPr>
           <w:p>
             <w:r>
-              <w:t xml:space="preserve">Bản tham khảo của Apps Script (đã ẩn API key) — để biết cấu trúc code, KHÔNG dùng để deploy (thiếu key thật).</w:t>
+              <w:t xml:space="preserve">Apps Script bản THẬT (có API key) — dùng để dán vào script.google.com khi deploy.</w:t>
+            </w:r>
+          </w:p>
+        </w:tc>
+      </w:tr>
+      <w:tr>
+        <w:tc>
+          <w:tcPr>
+            <w:tcW w:type="pct" w:w="30%"/>
+            <w:tcMar>
+              <w:top w:type="dxa" w:w="100"/>
+              <w:left w:type="dxa" w:w="120"/>
+              <w:bottom w:type="dxa" w:w="100"/>
+              <w:right w:type="dxa" w:w="120"/>
+            </w:tcMar>
+          </w:tcPr>
+          <w:p>
+            <w:r>
+              <w:rPr>
+                <w:rFonts w:ascii="Consolas" w:cs="Consolas" w:eastAsia="Consolas" w:hAnsi="Consolas"/>
+                <w:b/>
+                <w:bCs/>
+                <w:sz w:val="20"/>
+                <w:szCs w:val="20"/>
+              </w:rPr>
+              <w:t xml:space="preserve">WebTest_TheoDang/code.public.gs</w:t>
+            </w:r>
+          </w:p>
+        </w:tc>
+        <w:tc>
+          <w:tcPr>
+            <w:tcW w:type="pct" w:w="70%"/>
+            <w:tcMar>
+              <w:top w:type="dxa" w:w="100"/>
+              <w:left w:type="dxa" w:w="120"/>
+              <w:bottom w:type="dxa" w:w="100"/>
+              <w:right w:type="dxa" w:w="120"/>
+            </w:tcMar>
+          </w:tcPr>
+          <w:p>
+            <w:r>
+              <w:t xml:space="preserve">Bản tham khảo đã ẩn API key — chỉ dùng để tham khảo cấu trúc hoặc để push lên GitHub, KHÔNG dùng để deploy.</w:t>
+            </w:r>
+          </w:p>
+        </w:tc>
+      </w:tr>
+      <w:tr>
+        <w:tc>
+          <w:tcPr>
+            <w:tcW w:type="pct" w:w="30%"/>
+            <w:tcMar>
+              <w:top w:type="dxa" w:w="100"/>
+              <w:left w:type="dxa" w:w="120"/>
+              <w:bottom w:type="dxa" w:w="100"/>
+              <w:right w:type="dxa" w:w="120"/>
+            </w:tcMar>
+          </w:tcPr>
+          <w:p>
+            <w:r>
+              <w:rPr>
+                <w:rFonts w:ascii="Consolas" w:cs="Consolas" w:eastAsia="Consolas" w:hAnsi="Consolas"/>
+                <w:b/>
+                <w:bCs/>
+                <w:sz w:val="20"/>
+                <w:szCs w:val="20"/>
+              </w:rPr>
+              <w:t xml:space="preserve">HUONG_DAN/HuongDan_DoiSheet_AppsScript_GitHub.docx</w:t>
+            </w:r>
+          </w:p>
+        </w:tc>
+        <w:tc>
+          <w:tcPr>
+            <w:tcW w:type="pct" w:w="70%"/>
+            <w:tcMar>
+              <w:top w:type="dxa" w:w="100"/>
+              <w:left w:type="dxa" w:w="120"/>
+              <w:bottom w:type="dxa" w:w="100"/>
+              <w:right w:type="dxa" w:w="120"/>
+            </w:tcMar>
+          </w:tcPr>
+          <w:p>
+            <w:r>
+              <w:t xml:space="preserve">Chính là file hướng dẫn bạn đang đọc.</w:t>
             </w:r>
           </w:p>
         </w:tc>
       </w:tr>
     </w:tbl>
-    <w:p>
-      <w:pPr>
-        <w:spacing w:after="150"/>
-      </w:pPr>
-    </w:p>
-    <w:p>
-      <w:pPr>
-        <w:spacing w:after="150"/>
-      </w:pPr>
-      <w:r>
-        <w:rPr>
-          <w:i/>
-          <w:iCs/>
-          <w:color w:val="595959"/>
-          <w:sz w:val="20"/>
-          <w:szCs w:val="20"/>
-        </w:rPr>
-        <w:t xml:space="preserve">Bản gốc 3 file này cũng nằm sẵn trong thư mục 03. READING (update_links.py, push_github.bat) và WebTest_TheoDang (code.gs, code.public.gs) — không cần di chuyển gì, thư mục HUONG_DAN này chỉ để tiện tra cứu.</w:t>
-      </w:r>
-    </w:p>
     <w:sectPr>
       <w:pgSz w:w="12240" w:h="15840" w:orient="portrait"/>
       <w:pgMar w:top="1000" w:right="1100" w:bottom="1000" w:left="1100" w:header="708" w:footer="708" w:gutter="0"/>

</xml_diff>